<commit_message>
Resume: CYBER SECURITY ANALYST L1 @ Wipro (MNC)
</commit_message>
<xml_diff>
--- a/resumes/Resume_CYBER_SECURITY_ANALYST_L1_Wipro__MNC_.docx
+++ b/resumes/Resume_CYBER_SECURITY_ANALYST_L1_Wipro__MNC_.docx
@@ -413,7 +413,7 @@
           <w:sz w:val="19"/>
           <w:szCs w:val="19"/>
         </w:rPr>
-        <w:t>Triaged 50+ weekly inventory reimbursement cases by severity and policy eligibility, applying structured workflows for threat assessment and risk mitigation.</w:t>
+        <w:t>Triaged 50+ weekly inventory reimbursement cases by severity and policy eligibility, escalated findings to senior reviewers.</w:t>
       </w:r>
     </w:p>
     <w:p>
@@ -432,7 +432,7 @@
           <w:sz w:val="19"/>
           <w:szCs w:val="19"/>
         </w:rPr>
-        <w:t>Analyzed seller claims, identified policy violations and anomalous patterns, and escalated findings to senior reviewers, with a focus on incident response and security.</w:t>
+        <w:t>Conducted root cause analysis on seller claims, identifying policy violations and anomalous patterns, documenting findings in audit-ready case records.</w:t>
       </w:r>
     </w:p>
     <w:p>
@@ -451,7 +451,7 @@
           <w:sz w:val="19"/>
           <w:szCs w:val="19"/>
         </w:rPr>
-        <w:t>Maintained audit-ready case documentation recording investigation findings, decisions, evidence notes, and corrective actions, with a focus on evidence-based reporting and security.</w:t>
+        <w:t>Analyzed 200+ weekly cases, identifying recurring fraud patterns and reducing repeat-issue investigation time as a Cyber Security Analyst at Wipro in Bengaluru, India.</w:t>
       </w:r>
     </w:p>
     <w:p>
@@ -470,7 +470,7 @@
           <w:sz w:val="19"/>
           <w:szCs w:val="19"/>
         </w:rPr>
-        <w:t>Identified recurring fraud patterns in 200+ weekly cases, reducing repeat-issue investigation time through early flagging and threat detection.</w:t>
+        <w:t>Maintained audit-ready case documentation recording investigation findings, decisions, evidence notes, and corrective actions as a Cyber Security Analyst at Wipro in Bengaluru, Karnataka, India.</w:t>
       </w:r>
     </w:p>
     <w:p>
@@ -564,7 +564,7 @@
           <w:sz w:val="19"/>
           <w:szCs w:val="19"/>
         </w:rPr>
-        <w:t>Deployed Splunk SIEM with SPL searches for brute-force detection, lateral movement, and privilege escalation; mapped TTPs to MITRE ATT&amp;CK (T1110, T1078, T1059) and wrote incident report.</w:t>
+        <w:t>Deployed Splunk SIEM with SPL searches for brute-force detection, lateral movement, and privilege escalation (T1110, T1078, T1059); mapped TTPs and wrote incident report.</w:t>
       </w:r>
     </w:p>
     <w:p>
@@ -583,7 +583,7 @@
           <w:sz w:val="19"/>
           <w:szCs w:val="19"/>
         </w:rPr>
-        <w:t>Developed SOAR-style detection pipeline: Python script ingests Splunk alerts, enriches with VirusTotal API, and dispatches Telegram notifications with severity classification.</w:t>
+        <w:t>Built automated SOAR-style detection pipeline: Python script ingests Splunk alerts, enriches with VirusTotal API, and dispatches Telegram notifications with severity classification.</w:t>
       </w:r>
     </w:p>
     <w:p>
@@ -672,7 +672,7 @@
           <w:sz w:val="19"/>
           <w:szCs w:val="19"/>
         </w:rPr>
-        <w:t>Developed automated vulnerability assessment pipeline integrating Nessus and OpenVAS REST APIs in Python, generating CVE reports with CVSS severity classification and EPSS scoring from FIRST.org API.</w:t>
+        <w:t>Developed automated vulnerability assessment pipeline in Python, integrating Nessus and OpenVAS REST APIs, with EPSS scoring from FIRST.org API for prioritization.</w:t>
       </w:r>
     </w:p>
     <w:p>
@@ -691,7 +691,7 @@
           <w:sz w:val="19"/>
           <w:szCs w:val="19"/>
         </w:rPr>
-        <w:t>Developed OWASP Top 10 automated web checker to detect injection, auth, and SSRF vulnerabilities; documented SQL injection exploit and remediation.</w:t>
+        <w:t>Developed OWASP Top 10 automated web checker detecting injection, auth, and SSRF vulnerabilities; documented SQL injection exploit and remediation.</w:t>
       </w:r>
     </w:p>
     <w:p>
@@ -710,7 +710,7 @@
           <w:sz w:val="19"/>
           <w:szCs w:val="19"/>
         </w:rPr>
-        <w:t>Automated scan scheduling via Bash and cron; built delta-scan logic to flag new CVEs and calculate remediation SLA deadlines (Critical=24hrs, High=7 days, Medium=30 days).</w:t>
+        <w:t>Automated scan scheduling via Bash and cron; built delta-scan logic to flag new CVEs, calculate remediation SLA deadlines (Critical=24hrs, High=7 days, Medium=30 days).</w:t>
       </w:r>
     </w:p>
     <w:p>
@@ -846,7 +846,7 @@
           <w:sz w:val="19"/>
           <w:szCs w:val="19"/>
         </w:rPr>
-        <w:t>Python, Bash (basic), regular expressions, risk, assessment, response</w:t>
+        <w:t>Python, Bash (basic), regular expressions, security, incident response, compliance</w:t>
       </w:r>
     </w:p>
     <w:p>

</xml_diff>